<commit_message>
clarified instructions for both groups
</commit_message>
<xml_diff>
--- a/Group A/Instructions Group A.docx
+++ b/Group A/Instructions Group A.docx
@@ -91,7 +91,21 @@
         <w:rPr>
           <w:lang w:val="en-GB"/>
         </w:rPr>
-        <w:t>In the folder on github, you will find a dataset</w:t>
+        <w:t xml:space="preserve">In the folder on </w:t>
+      </w:r>
+      <w:proofErr w:type="spellStart"/>
+      <w:r>
+        <w:rPr>
+          <w:lang w:val="en-GB"/>
+        </w:rPr>
+        <w:t>github</w:t>
+      </w:r>
+      <w:proofErr w:type="spellEnd"/>
+      <w:r>
+        <w:rPr>
+          <w:lang w:val="en-GB"/>
+        </w:rPr>
+        <w:t>, you will find a dataset</w:t>
       </w:r>
       <w:r>
         <w:rPr>
@@ -217,12 +231,14 @@
           <w:lang w:val="en-GB"/>
         </w:rPr>
       </w:pPr>
+      <w:proofErr w:type="spellStart"/>
       <w:r>
         <w:rPr>
           <w:lang w:val="en-GB"/>
         </w:rPr>
         <w:t>D_Age</w:t>
       </w:r>
+      <w:proofErr w:type="spellEnd"/>
       <w:r>
         <w:rPr>
           <w:lang w:val="en-GB"/>
@@ -252,8 +268,15 @@
           <w:lang w:val="en-GB"/>
         </w:rPr>
         <w:cr/>
+      </w:r>
+      <w:proofErr w:type="spellStart"/>
+      <w:r>
+        <w:rPr>
+          <w:lang w:val="en-GB"/>
+        </w:rPr>
         <w:t>D_Gender</w:t>
       </w:r>
+      <w:proofErr w:type="spellEnd"/>
       <w:r>
         <w:rPr>
           <w:lang w:val="en-GB"/>
@@ -271,8 +294,15 @@
           <w:lang w:val="en-GB"/>
         </w:rPr>
         <w:cr/>
+      </w:r>
+      <w:proofErr w:type="spellStart"/>
+      <w:r>
+        <w:rPr>
+          <w:lang w:val="en-GB"/>
+        </w:rPr>
         <w:t>D_hours</w:t>
       </w:r>
+      <w:proofErr w:type="spellEnd"/>
       <w:r>
         <w:rPr>
           <w:lang w:val="en-GB"/>
@@ -314,8 +344,15 @@
           <w:lang w:val="en-GB"/>
         </w:rPr>
         <w:cr/>
+      </w:r>
+      <w:proofErr w:type="spellStart"/>
+      <w:r>
+        <w:rPr>
+          <w:lang w:val="en-GB"/>
+        </w:rPr>
         <w:t>D_allot</w:t>
       </w:r>
+      <w:proofErr w:type="spellEnd"/>
       <w:r>
         <w:rPr>
           <w:lang w:val="en-GB"/>
@@ -990,19 +1027,115 @@
     <w:p>
       <w:pPr>
         <w:rPr>
-          <w:lang w:val="en-GB"/>
-        </w:rPr>
-      </w:pPr>
-      <w:r>
-        <w:rPr>
-          <w:lang w:val="en-GB"/>
-        </w:rPr>
-        <w:t xml:space="preserve">It’s best to use dplyr to arrange your data. </w:t>
+          <w:rFonts w:ascii="Courier New" w:hAnsi="Courier New" w:cs="Courier New"/>
+          <w:lang w:val="en-GB"/>
+        </w:rPr>
+      </w:pPr>
+      <w:r>
+        <w:rPr>
+          <w:lang w:val="en-GB"/>
+        </w:rPr>
+        <w:t xml:space="preserve">Name your analysis file as follows: </w:t>
+      </w:r>
+      <w:proofErr w:type="spellStart"/>
+      <w:r>
+        <w:rPr>
+          <w:rFonts w:ascii="Courier New" w:hAnsi="Courier New" w:cs="Courier New"/>
+          <w:lang w:val="en-GB"/>
+        </w:rPr>
+        <w:t>Name_Group</w:t>
+      </w:r>
+      <w:r>
+        <w:rPr>
+          <w:rFonts w:ascii="Courier New" w:hAnsi="Courier New" w:cs="Courier New"/>
+          <w:lang w:val="en-GB"/>
+        </w:rPr>
+        <w:t>AorB_</w:t>
+      </w:r>
+      <w:proofErr w:type="gramStart"/>
+      <w:r>
+        <w:rPr>
+          <w:rFonts w:ascii="Courier New" w:hAnsi="Courier New" w:cs="Courier New"/>
+          <w:lang w:val="en-GB"/>
+        </w:rPr>
+        <w:t>analysis</w:t>
+      </w:r>
+      <w:r>
+        <w:rPr>
+          <w:rFonts w:ascii="Courier New" w:hAnsi="Courier New" w:cs="Courier New"/>
+          <w:lang w:val="en-GB"/>
+        </w:rPr>
+        <w:t>.R</w:t>
+      </w:r>
+      <w:proofErr w:type="spellEnd"/>
+      <w:proofErr w:type="gramEnd"/>
+      <w:r>
+        <w:rPr>
+          <w:rFonts w:ascii="Courier New" w:hAnsi="Courier New" w:cs="Courier New"/>
+          <w:lang w:val="en-GB"/>
+        </w:rPr>
+        <w:t xml:space="preserve"> </w:t>
       </w:r>
     </w:p>
     <w:p>
       <w:pPr>
         <w:rPr>
+          <w:rFonts w:ascii="Aptos" w:hAnsi="Aptos"/>
+          <w:lang w:val="en-GB"/>
+        </w:rPr>
+      </w:pPr>
+      <w:r>
+        <w:rPr>
+          <w:rFonts w:ascii="Aptos" w:hAnsi="Aptos" w:cs="Courier New"/>
+          <w:lang w:val="en-GB"/>
+        </w:rPr>
+        <w:t>Save it in the main folder</w:t>
+      </w:r>
+      <w:r>
+        <w:rPr>
+          <w:rFonts w:ascii="Aptos" w:hAnsi="Aptos" w:cs="Courier New"/>
+          <w:lang w:val="en-GB"/>
+        </w:rPr>
+        <w:t xml:space="preserve"> from the repository, the same folder</w:t>
+      </w:r>
+      <w:r>
+        <w:rPr>
+          <w:rFonts w:ascii="Aptos" w:hAnsi="Aptos" w:cs="Courier New"/>
+          <w:lang w:val="en-GB"/>
+        </w:rPr>
+        <w:t xml:space="preserve"> where the data are.</w:t>
+      </w:r>
+    </w:p>
+    <w:p>
+      <w:pPr>
+        <w:rPr>
+          <w:lang w:val="en-GB"/>
+        </w:rPr>
+      </w:pPr>
+      <w:r>
+        <w:rPr>
+          <w:lang w:val="en-GB"/>
+        </w:rPr>
+        <w:t xml:space="preserve">It’s best to use </w:t>
+      </w:r>
+      <w:proofErr w:type="spellStart"/>
+      <w:r>
+        <w:rPr>
+          <w:lang w:val="en-GB"/>
+        </w:rPr>
+        <w:t>dplyr</w:t>
+      </w:r>
+      <w:proofErr w:type="spellEnd"/>
+      <w:r>
+        <w:rPr>
+          <w:lang w:val="en-GB"/>
+        </w:rPr>
+        <w:t xml:space="preserve"> to arrange your data. </w:t>
+      </w:r>
+    </w:p>
+    <w:p>
+      <w:pPr>
+        <w:rPr>
           <w:lang w:val="en-GB"/>
         </w:rPr>
       </w:pPr>
@@ -1040,12 +1173,21 @@
           <w:lang w:val="en-GB"/>
         </w:rPr>
       </w:pPr>
-      <w:r>
-        <w:rPr>
-          <w:rFonts w:ascii="Courier New" w:hAnsi="Courier New" w:cs="Courier New"/>
-          <w:lang w:val="en-GB"/>
-        </w:rPr>
-        <w:t>df %&gt;%</w:t>
+      <w:proofErr w:type="spellStart"/>
+      <w:r>
+        <w:rPr>
+          <w:rFonts w:ascii="Courier New" w:hAnsi="Courier New" w:cs="Courier New"/>
+          <w:lang w:val="en-GB"/>
+        </w:rPr>
+        <w:t>df</w:t>
+      </w:r>
+      <w:proofErr w:type="spellEnd"/>
+      <w:r>
+        <w:rPr>
+          <w:rFonts w:ascii="Courier New" w:hAnsi="Courier New" w:cs="Courier New"/>
+          <w:lang w:val="en-GB"/>
+        </w:rPr>
+        <w:t xml:space="preserve"> %&gt;%</w:t>
       </w:r>
       <w:r>
         <w:rPr>
@@ -1059,7 +1201,39 @@
           <w:rFonts w:ascii="Courier New" w:hAnsi="Courier New" w:cs="Courier New"/>
           <w:lang w:val="en-GB"/>
         </w:rPr>
-        <w:t xml:space="preserve">  group_by(D_allot) %&gt;%</w:t>
+        <w:t xml:space="preserve">  </w:t>
+      </w:r>
+      <w:proofErr w:type="spellStart"/>
+      <w:r>
+        <w:rPr>
+          <w:rFonts w:ascii="Courier New" w:hAnsi="Courier New" w:cs="Courier New"/>
+          <w:lang w:val="en-GB"/>
+        </w:rPr>
+        <w:t>group_by</w:t>
+      </w:r>
+      <w:proofErr w:type="spellEnd"/>
+      <w:r>
+        <w:rPr>
+          <w:rFonts w:ascii="Courier New" w:hAnsi="Courier New" w:cs="Courier New"/>
+          <w:lang w:val="en-GB"/>
+        </w:rPr>
+        <w:t>(</w:t>
+      </w:r>
+      <w:proofErr w:type="spellStart"/>
+      <w:r>
+        <w:rPr>
+          <w:rFonts w:ascii="Courier New" w:hAnsi="Courier New" w:cs="Courier New"/>
+          <w:lang w:val="en-GB"/>
+        </w:rPr>
+        <w:t>D_allot</w:t>
+      </w:r>
+      <w:proofErr w:type="spellEnd"/>
+      <w:r>
+        <w:rPr>
+          <w:rFonts w:ascii="Courier New" w:hAnsi="Courier New" w:cs="Courier New"/>
+          <w:lang w:val="en-GB"/>
+        </w:rPr>
+        <w:t>) %&gt;%</w:t>
       </w:r>
       <w:r>
         <w:rPr>
@@ -1134,12 +1308,37 @@
           <w:lang w:val="en-GB"/>
         </w:rPr>
       </w:pPr>
-      <w:r>
-        <w:rPr>
-          <w:rFonts w:ascii="Courier New" w:hAnsi="Courier New" w:cs="Courier New"/>
-          <w:lang w:val="en-GB"/>
-        </w:rPr>
-        <w:t>df &lt;- df %&gt;%</w:t>
+      <w:proofErr w:type="spellStart"/>
+      <w:r>
+        <w:rPr>
+          <w:rFonts w:ascii="Courier New" w:hAnsi="Courier New" w:cs="Courier New"/>
+          <w:lang w:val="en-GB"/>
+        </w:rPr>
+        <w:t>df</w:t>
+      </w:r>
+      <w:proofErr w:type="spellEnd"/>
+      <w:r>
+        <w:rPr>
+          <w:rFonts w:ascii="Courier New" w:hAnsi="Courier New" w:cs="Courier New"/>
+          <w:lang w:val="en-GB"/>
+        </w:rPr>
+        <w:t xml:space="preserve"> &lt;- </w:t>
+      </w:r>
+      <w:proofErr w:type="spellStart"/>
+      <w:r>
+        <w:rPr>
+          <w:rFonts w:ascii="Courier New" w:hAnsi="Courier New" w:cs="Courier New"/>
+          <w:lang w:val="en-GB"/>
+        </w:rPr>
+        <w:t>df</w:t>
+      </w:r>
+      <w:proofErr w:type="spellEnd"/>
+      <w:r>
+        <w:rPr>
+          <w:rFonts w:ascii="Courier New" w:hAnsi="Courier New" w:cs="Courier New"/>
+          <w:lang w:val="en-GB"/>
+        </w:rPr>
+        <w:t xml:space="preserve"> %&gt;%</w:t>
       </w:r>
       <w:r>
         <w:rPr>
@@ -1155,6 +1354,7 @@
         </w:rPr>
         <w:t xml:space="preserve">  mutate(</w:t>
       </w:r>
+      <w:proofErr w:type="spellStart"/>
       <w:r>
         <w:rPr>
           <w:rFonts w:ascii="Courier New" w:hAnsi="Courier New" w:cs="Courier New"/>
@@ -1168,7 +1368,47 @@
           <w:rFonts w:ascii="Courier New" w:hAnsi="Courier New" w:cs="Courier New"/>
           <w:lang w:val="en-GB"/>
         </w:rPr>
-        <w:t>_total = rowSums(across(starts_with("</w:t>
+        <w:t>_total</w:t>
+      </w:r>
+      <w:proofErr w:type="spellEnd"/>
+      <w:r>
+        <w:rPr>
+          <w:rFonts w:ascii="Courier New" w:hAnsi="Courier New" w:cs="Courier New"/>
+          <w:lang w:val="en-GB"/>
+        </w:rPr>
+        <w:t xml:space="preserve"> = </w:t>
+      </w:r>
+      <w:proofErr w:type="spellStart"/>
+      <w:r>
+        <w:rPr>
+          <w:rFonts w:ascii="Courier New" w:hAnsi="Courier New" w:cs="Courier New"/>
+          <w:lang w:val="en-GB"/>
+        </w:rPr>
+        <w:t>rowSums</w:t>
+      </w:r>
+      <w:proofErr w:type="spellEnd"/>
+      <w:r>
+        <w:rPr>
+          <w:rFonts w:ascii="Courier New" w:hAnsi="Courier New" w:cs="Courier New"/>
+          <w:lang w:val="en-GB"/>
+        </w:rPr>
+        <w:t>(across(</w:t>
+      </w:r>
+      <w:proofErr w:type="spellStart"/>
+      <w:r>
+        <w:rPr>
+          <w:rFonts w:ascii="Courier New" w:hAnsi="Courier New" w:cs="Courier New"/>
+          <w:lang w:val="en-GB"/>
+        </w:rPr>
+        <w:t>starts_with</w:t>
+      </w:r>
+      <w:proofErr w:type="spellEnd"/>
+      <w:r>
+        <w:rPr>
+          <w:rFonts w:ascii="Courier New" w:hAnsi="Courier New" w:cs="Courier New"/>
+          <w:lang w:val="en-GB"/>
+        </w:rPr>
+        <w:t>("</w:t>
       </w:r>
       <w:r>
         <w:rPr>
@@ -1277,8 +1517,17 @@
           <w:rFonts w:ascii="Aptos" w:hAnsi="Aptos" w:cs="Courier New"/>
           <w:lang w:val="en-GB"/>
         </w:rPr>
-        <w:t>check that no one is doing anything on Github</w:t>
-      </w:r>
+        <w:t xml:space="preserve">check that no one is doing anything on </w:t>
+      </w:r>
+      <w:proofErr w:type="spellStart"/>
+      <w:r>
+        <w:rPr>
+          <w:rFonts w:ascii="Aptos" w:hAnsi="Aptos" w:cs="Courier New"/>
+          <w:lang w:val="en-GB"/>
+        </w:rPr>
+        <w:t>Github</w:t>
+      </w:r>
+      <w:proofErr w:type="spellEnd"/>
       <w:r>
         <w:rPr>
           <w:rFonts w:ascii="Aptos" w:hAnsi="Aptos" w:cs="Courier New"/>
@@ -1311,7 +1560,23 @@
           <w:rFonts w:ascii="Aptos" w:hAnsi="Aptos" w:cs="Courier New"/>
           <w:lang w:val="en-GB"/>
         </w:rPr>
-        <w:t>the github repository</w:t>
+        <w:t xml:space="preserve">the </w:t>
+      </w:r>
+      <w:proofErr w:type="spellStart"/>
+      <w:r>
+        <w:rPr>
+          <w:rFonts w:ascii="Aptos" w:hAnsi="Aptos" w:cs="Courier New"/>
+          <w:lang w:val="en-GB"/>
+        </w:rPr>
+        <w:t>github</w:t>
+      </w:r>
+      <w:proofErr w:type="spellEnd"/>
+      <w:r>
+        <w:rPr>
+          <w:rFonts w:ascii="Aptos" w:hAnsi="Aptos" w:cs="Courier New"/>
+          <w:lang w:val="en-GB"/>
+        </w:rPr>
+        <w:t xml:space="preserve"> repository</w:t>
       </w:r>
       <w:r>
         <w:rPr>
@@ -1371,6 +1636,7 @@
           <w:rFonts w:ascii="Aptos" w:hAnsi="Aptos" w:cs="Courier New"/>
           <w:lang w:val="en-GB"/>
         </w:rPr>
+        <w:lastRenderedPageBreak/>
         <w:t>Stage and commit your changes (</w:t>
       </w:r>
       <w:r>

</xml_diff>